<commit_message>
Publish revised Chapter 10 text
</commit_message>
<xml_diff>
--- a/public/chapter-10/Chapitre_10_Duodenum_version_complete_zones_reflexes_revisees.docx
+++ b/public/chapter-10/Chapitre_10_Duodenum_version_complete_zones_reflexes_revisees.docx
@@ -22,8 +22,6 @@
     <w:p>
       <w:pPr>
         <w:pStyle w:val="Heading1"/>
-        <w:keepNext/>
-        <w:keepLines/>
         <w:spacing w:before="160" w:after="60"/>
         <w:rPr>
           <w:lang w:val="fr-FR"/>
@@ -38,7 +36,6 @@
     </w:p>
     <w:p>
       <w:pPr>
-        <w:widowControl/>
         <w:rPr>
           <w:lang w:val="fr-FR"/>
         </w:rPr>
@@ -52,7 +49,6 @@
     </w:p>
     <w:p>
       <w:pPr>
-        <w:widowControl/>
         <w:rPr>
           <w:lang w:val="fr-FR"/>
         </w:rPr>
@@ -67,8 +63,6 @@
     <w:p>
       <w:pPr>
         <w:pStyle w:val="Heading1"/>
-        <w:keepNext/>
-        <w:keepLines/>
         <w:spacing w:before="160" w:after="60"/>
         <w:rPr>
           <w:lang w:val="fr-FR"/>
@@ -83,7 +77,6 @@
     </w:p>
     <w:p>
       <w:pPr>
-        <w:widowControl/>
         <w:rPr>
           <w:lang w:val="fr-FR"/>
         </w:rPr>
@@ -97,7 +90,6 @@
     </w:p>
     <w:p>
       <w:pPr>
-        <w:widowControl/>
         <w:rPr>
           <w:lang w:val="fr-FR"/>
         </w:rPr>
@@ -111,7 +103,6 @@
     </w:p>
     <w:p>
       <w:pPr>
-        <w:widowControl/>
         <w:rPr>
           <w:lang w:val="fr-FR"/>
         </w:rPr>
@@ -153,8 +144,6 @@
     <w:p>
       <w:pPr>
         <w:pStyle w:val="Heading1"/>
-        <w:keepNext/>
-        <w:keepLines/>
         <w:spacing w:before="160" w:after="60"/>
         <w:rPr>
           <w:lang w:val="fr-FR"/>
@@ -169,7 +158,6 @@
     </w:p>
     <w:p>
       <w:pPr>
-        <w:widowControl/>
         <w:rPr>
           <w:lang w:val="fr-FR"/>
         </w:rPr>
@@ -197,7 +185,6 @@
     </w:p>
     <w:p>
       <w:pPr>
-        <w:widowControl/>
         <w:rPr>
           <w:lang w:val="fr-FR"/>
         </w:rPr>
@@ -212,8 +199,6 @@
     <w:p>
       <w:pPr>
         <w:pStyle w:val="Heading2"/>
-        <w:keepNext/>
-        <w:keepLines/>
         <w:spacing w:before="100" w:after="60"/>
         <w:rPr>
           <w:lang w:val="fr-FR"/>
@@ -228,7 +213,6 @@
     </w:p>
     <w:p>
       <w:pPr>
-        <w:widowControl/>
         <w:rPr>
           <w:lang w:val="fr-FR"/>
         </w:rPr>
@@ -242,7 +226,6 @@
     </w:p>
     <w:p>
       <w:pPr>
-        <w:widowControl/>
         <w:rPr>
           <w:lang w:val="fr-FR"/>
         </w:rPr>
@@ -256,7 +239,6 @@
     </w:p>
     <w:p>
       <w:pPr>
-        <w:widowControl/>
         <w:rPr>
           <w:lang w:val="fr-FR"/>
         </w:rPr>
@@ -270,7 +252,6 @@
     </w:p>
     <w:p>
       <w:pPr>
-        <w:widowControl/>
         <w:rPr>
           <w:lang w:val="fr-FR"/>
         </w:rPr>
@@ -284,7 +265,6 @@
     </w:p>
     <w:p>
       <w:pPr>
-        <w:widowControl/>
         <w:rPr>
           <w:lang w:val="fr-FR"/>
         </w:rPr>
@@ -299,8 +279,6 @@
     <w:p>
       <w:pPr>
         <w:pStyle w:val="Heading2"/>
-        <w:keepNext/>
-        <w:keepLines/>
         <w:spacing w:before="100" w:after="60"/>
         <w:rPr>
           <w:lang w:val="fr-FR"/>
@@ -315,7 +293,6 @@
     </w:p>
     <w:p>
       <w:pPr>
-        <w:widowControl/>
         <w:rPr>
           <w:lang w:val="fr-FR"/>
         </w:rPr>
@@ -329,7 +306,6 @@
     </w:p>
     <w:p>
       <w:pPr>
-        <w:widowControl/>
         <w:rPr>
           <w:lang w:val="fr-FR"/>
         </w:rPr>
@@ -343,7 +319,6 @@
     </w:p>
     <w:p>
       <w:pPr>
-        <w:widowControl/>
         <w:rPr>
           <w:lang w:val="fr-FR"/>
         </w:rPr>
@@ -383,7 +358,19 @@
     </w:p>
     <w:p>
       <w:pPr>
-        <w:widowControl/>
+        <w:rPr>
+          <w:lang w:val="fr-FR"/>
+        </w:rPr>
+      </w:pPr>
+      <w:r>
+        <w:rPr>
+          <w:lang w:val="fr-FR"/>
+        </w:rPr>
+        <w:t>Papille duodénale mineure : située plus haut, elle correspond à l’abouchement du canal pancréatique accessoire de Santorini lorsqu’il est présent et perméable.</w:t>
+      </w:r>
+    </w:p>
+    <w:p>
+      <w:pPr>
         <w:rPr>
           <w:lang w:val="fr-FR"/>
         </w:rPr>
@@ -393,28 +380,12 @@
           <w:lang w:val="fr-FR"/>
         </w:rPr>
         <w:lastRenderedPageBreak/>
-        <w:t>Papille duodénale mineure : située plus haut, elle correspond à l’abouchement du canal pancréatique accessoire de Santorini lorsqu’il est présent et perméable.</w:t>
-      </w:r>
-    </w:p>
-    <w:p>
-      <w:pPr>
-        <w:widowControl/>
-        <w:rPr>
-          <w:lang w:val="fr-FR"/>
-        </w:rPr>
-      </w:pPr>
-      <w:r>
-        <w:rPr>
-          <w:lang w:val="fr-FR"/>
-        </w:rPr>
         <w:t>L’angle entre D2 et D3 est appelé genu inferius.</w:t>
       </w:r>
     </w:p>
     <w:p>
       <w:pPr>
         <w:pStyle w:val="Heading2"/>
-        <w:keepNext/>
-        <w:keepLines/>
         <w:spacing w:before="100" w:after="60"/>
         <w:rPr>
           <w:lang w:val="fr-FR"/>
@@ -429,7 +400,6 @@
     </w:p>
     <w:p>
       <w:pPr>
-        <w:widowControl/>
         <w:rPr>
           <w:lang w:val="fr-FR"/>
         </w:rPr>
@@ -443,7 +413,6 @@
     </w:p>
     <w:p>
       <w:pPr>
-        <w:widowControl/>
         <w:rPr>
           <w:lang w:val="fr-FR"/>
         </w:rPr>
@@ -458,8 +427,6 @@
     <w:p>
       <w:pPr>
         <w:pStyle w:val="Heading2"/>
-        <w:keepNext/>
-        <w:keepLines/>
         <w:spacing w:before="100" w:after="60"/>
         <w:rPr>
           <w:lang w:val="fr-FR"/>
@@ -474,7 +441,6 @@
     </w:p>
     <w:p>
       <w:pPr>
-        <w:widowControl/>
         <w:rPr>
           <w:lang w:val="fr-FR"/>
         </w:rPr>
@@ -488,7 +454,6 @@
     </w:p>
     <w:p>
       <w:pPr>
-        <w:widowControl/>
         <w:rPr>
           <w:lang w:val="fr-FR"/>
         </w:rPr>
@@ -503,8 +468,6 @@
     <w:p>
       <w:pPr>
         <w:pStyle w:val="Heading2"/>
-        <w:keepNext/>
-        <w:keepLines/>
         <w:spacing w:before="100" w:after="60"/>
         <w:rPr>
           <w:lang w:val="fr-FR"/>
@@ -519,7 +482,6 @@
     </w:p>
     <w:p>
       <w:pPr>
-        <w:widowControl/>
         <w:rPr>
           <w:lang w:val="fr-FR"/>
         </w:rPr>
@@ -533,7 +495,6 @@
     </w:p>
     <w:p>
       <w:pPr>
-        <w:widowControl/>
         <w:rPr>
           <w:lang w:val="fr-FR"/>
         </w:rPr>
@@ -548,8 +509,6 @@
     <w:p>
       <w:pPr>
         <w:pStyle w:val="Heading2"/>
-        <w:keepNext/>
-        <w:keepLines/>
         <w:spacing w:before="100" w:after="60"/>
         <w:rPr>
           <w:lang w:val="fr-FR"/>
@@ -577,7 +536,6 @@
     </w:p>
     <w:p>
       <w:pPr>
-        <w:widowControl/>
         <w:rPr>
           <w:lang w:val="fr-FR"/>
         </w:rPr>
@@ -591,7 +549,6 @@
     </w:p>
     <w:p>
       <w:pPr>
-        <w:widowControl/>
         <w:rPr>
           <w:lang w:val="fr-FR"/>
         </w:rPr>
@@ -606,8 +563,6 @@
     <w:p>
       <w:pPr>
         <w:pStyle w:val="Heading1"/>
-        <w:keepNext/>
-        <w:keepLines/>
         <w:spacing w:before="160" w:after="60"/>
         <w:rPr>
           <w:lang w:val="fr-FR"/>
@@ -622,7 +577,6 @@
     </w:p>
     <w:p>
       <w:pPr>
-        <w:widowControl/>
         <w:rPr>
           <w:lang w:val="fr-FR"/>
         </w:rPr>
@@ -636,7 +590,6 @@
     </w:p>
     <w:p>
       <w:pPr>
-        <w:widowControl/>
         <w:rPr>
           <w:lang w:val="fr-FR"/>
         </w:rPr>
@@ -650,7 +603,6 @@
     </w:p>
     <w:p>
       <w:pPr>
-        <w:widowControl/>
         <w:rPr>
           <w:lang w:val="fr-FR"/>
         </w:rPr>
@@ -664,7 +616,6 @@
     </w:p>
     <w:p>
       <w:pPr>
-        <w:widowControl/>
         <w:rPr>
           <w:lang w:val="fr-FR"/>
         </w:rPr>
@@ -678,7 +629,6 @@
     </w:p>
     <w:p>
       <w:pPr>
-        <w:widowControl/>
         <w:rPr>
           <w:lang w:val="fr-FR"/>
         </w:rPr>
@@ -692,7 +642,6 @@
     </w:p>
     <w:p>
       <w:pPr>
-        <w:widowControl/>
         <w:rPr>
           <w:lang w:val="fr-FR"/>
         </w:rPr>
@@ -706,7 +655,6 @@
     </w:p>
     <w:p>
       <w:pPr>
-        <w:widowControl/>
         <w:rPr>
           <w:lang w:val="fr-FR"/>
         </w:rPr>
@@ -721,8 +669,6 @@
     <w:p>
       <w:pPr>
         <w:pStyle w:val="Heading2"/>
-        <w:keepNext/>
-        <w:keepLines/>
         <w:spacing w:before="100" w:after="60"/>
         <w:rPr>
           <w:lang w:val="fr-FR"/>
@@ -737,7 +683,6 @@
     </w:p>
     <w:p>
       <w:pPr>
-        <w:widowControl/>
         <w:rPr>
           <w:lang w:val="fr-FR"/>
         </w:rPr>
@@ -751,7 +696,32 @@
     </w:p>
     <w:p>
       <w:pPr>
-        <w:widowControl/>
+        <w:rPr>
+          <w:lang w:val="fr-FR"/>
+        </w:rPr>
+      </w:pPr>
+      <w:r>
+        <w:rPr>
+          <w:lang w:val="fr-FR"/>
+        </w:rPr>
+        <w:t>Il est délimité par deux lignes horizontales et deux lignes verticales décrites ici comme repères de surface.</w:t>
+      </w:r>
+    </w:p>
+    <w:p>
+      <w:pPr>
+        <w:rPr>
+          <w:lang w:val="fr-FR"/>
+        </w:rPr>
+      </w:pPr>
+      <w:r>
+        <w:rPr>
+          <w:lang w:val="fr-FR"/>
+        </w:rPr>
+        <w:t>Dans ce cadre, il concentre des éléments viscéraux, vasculaires, nerveux, lymphatiques et ligamentaires en rapport étroit avec D2.</w:t>
+      </w:r>
+    </w:p>
+    <w:p>
+      <w:pPr>
         <w:rPr>
           <w:lang w:val="fr-FR"/>
         </w:rPr>
@@ -761,42 +731,12 @@
           <w:lang w:val="fr-FR"/>
         </w:rPr>
         <w:lastRenderedPageBreak/>
-        <w:t>Il est délimité par deux lignes horizontales et deux lignes verticales décrites ici comme repères de surface.</w:t>
-      </w:r>
-    </w:p>
-    <w:p>
-      <w:pPr>
-        <w:widowControl/>
-        <w:rPr>
-          <w:lang w:val="fr-FR"/>
-        </w:rPr>
-      </w:pPr>
-      <w:r>
-        <w:rPr>
-          <w:lang w:val="fr-FR"/>
-        </w:rPr>
-        <w:t>Dans ce cadre, il concentre des éléments viscéraux, vasculaires, nerveux, lymphatiques et ligamentaires en rapport étroit avec D2.</w:t>
-      </w:r>
-    </w:p>
-    <w:p>
-      <w:pPr>
-        <w:widowControl/>
-        <w:rPr>
-          <w:lang w:val="fr-FR"/>
-        </w:rPr>
-      </w:pPr>
-      <w:r>
-        <w:rPr>
-          <w:lang w:val="fr-FR"/>
-        </w:rPr>
         <w:t>Dans le cadre ROP, ce quadrilatère présente un intérêt pratique car il regroupe plusieurs structures anatomiques fortement solidaires du deuxième duodénum.</w:t>
       </w:r>
     </w:p>
     <w:p>
       <w:pPr>
         <w:pStyle w:val="Heading1"/>
-        <w:keepNext/>
-        <w:keepLines/>
         <w:spacing w:before="160" w:after="60"/>
         <w:rPr>
           <w:lang w:val="fr-FR"/>
@@ -812,58 +752,78 @@
     <w:p>
       <w:pPr>
         <w:pStyle w:val="Heading2"/>
-        <w:keepNext/>
-        <w:keepLines/>
         <w:spacing w:before="100" w:after="60"/>
-      </w:pPr>
-      <w:r>
+        <w:rPr>
+          <w:lang w:val="fr-FR"/>
+        </w:rPr>
+      </w:pPr>
+      <w:r>
+        <w:rPr>
+          <w:lang w:val="fr-FR"/>
+        </w:rPr>
         <w:t>5.1. Vascularisation artérielle</w:t>
       </w:r>
     </w:p>
     <w:p>
       <w:pPr>
-        <w:widowControl/>
-        <w:rPr>
-          <w:lang w:val="fr-FR"/>
-        </w:rPr>
-      </w:pPr>
-      <w:r>
-        <w:rPr>
-          <w:lang w:val="fr-FR"/>
-        </w:rPr>
-        <w:t>la vascularisation duodénale dépend principalement des arcades pancréatico-duodénales, issues des territoires cœliaque et mésentérique supérieur, qui s’anastomosent entre elles.</w:t>
+        <w:rPr>
+          <w:lang w:val="fr-FR"/>
+        </w:rPr>
+      </w:pPr>
+      <w:proofErr w:type="gramStart"/>
+      <w:r>
+        <w:rPr>
+          <w:lang w:val="fr-FR"/>
+        </w:rPr>
+        <w:t>la</w:t>
+      </w:r>
+      <w:proofErr w:type="gramEnd"/>
+      <w:r>
+        <w:rPr>
+          <w:lang w:val="fr-FR"/>
+        </w:rPr>
+        <w:t xml:space="preserve"> vascularisation duodénale dépend principalement des arcades pancréatico-duodénales, issues des territoires cœliaque et mésentérique supérieur, qui s’anastomosent entre elles.</w:t>
       </w:r>
     </w:p>
     <w:p>
       <w:pPr>
         <w:pStyle w:val="Heading2"/>
-        <w:keepNext/>
-        <w:keepLines/>
         <w:spacing w:before="100" w:after="60"/>
-      </w:pPr>
-      <w:r>
+        <w:rPr>
+          <w:lang w:val="fr-FR"/>
+        </w:rPr>
+      </w:pPr>
+      <w:r>
+        <w:rPr>
+          <w:lang w:val="fr-FR"/>
+        </w:rPr>
         <w:t>5.2. Vascularisation veineuse</w:t>
       </w:r>
     </w:p>
     <w:p>
       <w:pPr>
-        <w:widowControl/>
-        <w:rPr>
-          <w:lang w:val="fr-FR"/>
-        </w:rPr>
-      </w:pPr>
-      <w:r>
-        <w:rPr>
-          <w:lang w:val="fr-FR"/>
-        </w:rPr>
-        <w:t>les veines pancréatico-duodénales rejoignent la veine mésentérique supérieure, en continuité avec le système porte.</w:t>
+        <w:rPr>
+          <w:lang w:val="fr-FR"/>
+        </w:rPr>
+      </w:pPr>
+      <w:proofErr w:type="gramStart"/>
+      <w:r>
+        <w:rPr>
+          <w:lang w:val="fr-FR"/>
+        </w:rPr>
+        <w:t>les</w:t>
+      </w:r>
+      <w:proofErr w:type="gramEnd"/>
+      <w:r>
+        <w:rPr>
+          <w:lang w:val="fr-FR"/>
+        </w:rPr>
+        <w:t xml:space="preserve"> veines pancréatico-duodénales rejoignent la veine mésentérique supérieure, en continuité avec le système porte.</w:t>
       </w:r>
     </w:p>
     <w:p>
       <w:pPr>
         <w:pStyle w:val="Heading1"/>
-        <w:keepNext/>
-        <w:keepLines/>
         <w:spacing w:before="160" w:after="60"/>
         <w:rPr>
           <w:lang w:val="fr-FR"/>
@@ -878,7 +838,6 @@
     </w:p>
     <w:p>
       <w:pPr>
-        <w:widowControl/>
         <w:rPr>
           <w:lang w:val="fr-FR"/>
         </w:rPr>
@@ -892,7 +851,6 @@
     </w:p>
     <w:p>
       <w:pPr>
-        <w:widowControl/>
         <w:rPr>
           <w:lang w:val="fr-FR"/>
         </w:rPr>
@@ -907,8 +865,6 @@
     <w:p>
       <w:pPr>
         <w:pStyle w:val="Heading1"/>
-        <w:keepNext/>
-        <w:keepLines/>
         <w:spacing w:before="160" w:after="60"/>
         <w:rPr>
           <w:lang w:val="fr-FR"/>
@@ -924,31 +880,41 @@
     <w:p>
       <w:pPr>
         <w:pStyle w:val="Heading2"/>
-        <w:keepNext/>
-        <w:keepLines/>
         <w:spacing w:before="100" w:after="60"/>
-      </w:pPr>
-      <w:r>
+        <w:rPr>
+          <w:lang w:val="fr-FR"/>
+        </w:rPr>
+      </w:pPr>
+      <w:r>
+        <w:rPr>
+          <w:lang w:val="fr-FR"/>
+        </w:rPr>
         <w:t>7.1. Fonction digestive et neutralisation</w:t>
       </w:r>
     </w:p>
     <w:p>
       <w:pPr>
-        <w:widowControl/>
-        <w:rPr>
-          <w:lang w:val="fr-FR"/>
-        </w:rPr>
-      </w:pPr>
-      <w:r>
-        <w:rPr>
-          <w:lang w:val="fr-FR"/>
-        </w:rPr>
-        <w:t>le duodénum participe à la digestion et à l’absorption initiale de plusieurs nutriments.</w:t>
-      </w:r>
-    </w:p>
-    <w:p>
-      <w:pPr>
-        <w:widowControl/>
+        <w:rPr>
+          <w:lang w:val="fr-FR"/>
+        </w:rPr>
+      </w:pPr>
+      <w:proofErr w:type="gramStart"/>
+      <w:r>
+        <w:rPr>
+          <w:lang w:val="fr-FR"/>
+        </w:rPr>
+        <w:t>le</w:t>
+      </w:r>
+      <w:proofErr w:type="gramEnd"/>
+      <w:r>
+        <w:rPr>
+          <w:lang w:val="fr-FR"/>
+        </w:rPr>
+        <w:t xml:space="preserve"> duodénum participe à la digestion et à l’absorption initiale de plusieurs nutriments.</w:t>
+      </w:r>
+    </w:p>
+    <w:p>
+      <w:pPr>
         <w:rPr>
           <w:lang w:val="fr-FR"/>
         </w:rPr>
@@ -962,7 +928,6 @@
     </w:p>
     <w:p>
       <w:pPr>
-        <w:widowControl/>
         <w:rPr>
           <w:lang w:val="fr-FR"/>
         </w:rPr>
@@ -977,56 +942,77 @@
     <w:p>
       <w:pPr>
         <w:pStyle w:val="Heading2"/>
-        <w:keepNext/>
-        <w:keepLines/>
         <w:spacing w:before="100" w:after="60"/>
-      </w:pPr>
-      <w:r>
+        <w:rPr>
+          <w:lang w:val="fr-FR"/>
+        </w:rPr>
+      </w:pPr>
+      <w:r>
+        <w:rPr>
+          <w:lang w:val="fr-FR"/>
+        </w:rPr>
         <w:t>7.2. Motricité</w:t>
       </w:r>
     </w:p>
     <w:p>
       <w:pPr>
-        <w:widowControl/>
-        <w:rPr>
-          <w:lang w:val="fr-FR"/>
-        </w:rPr>
-      </w:pPr>
-      <w:r>
-        <w:rPr>
-          <w:lang w:val="fr-FR"/>
-        </w:rPr>
-        <w:t>le duodénum présente une motricité régulière, coordonnée avec les phases digestives, permettant la progression et le brassage du chyme vers le jéjunum.</w:t>
+        <w:rPr>
+          <w:lang w:val="fr-FR"/>
+        </w:rPr>
+      </w:pPr>
+      <w:proofErr w:type="gramStart"/>
+      <w:r>
+        <w:rPr>
+          <w:lang w:val="fr-FR"/>
+        </w:rPr>
+        <w:t>le</w:t>
+      </w:r>
+      <w:proofErr w:type="gramEnd"/>
+      <w:r>
+        <w:rPr>
+          <w:lang w:val="fr-FR"/>
+        </w:rPr>
+        <w:t xml:space="preserve"> duodénum présente une motricité régulière, coordonnée avec les phases digestives, permettant la progression et le brassage du chyme vers le jéjunum.</w:t>
       </w:r>
     </w:p>
     <w:p>
       <w:pPr>
         <w:pStyle w:val="Heading2"/>
-        <w:keepNext/>
-        <w:keepLines/>
         <w:spacing w:before="100" w:after="60"/>
-      </w:pPr>
-      <w:r>
+        <w:rPr>
+          <w:lang w:val="fr-FR"/>
+        </w:rPr>
+      </w:pPr>
+      <w:r>
+        <w:rPr>
+          <w:lang w:val="fr-FR"/>
+        </w:rPr>
         <w:t>7.3. Sécrétions digestives et protection muqueuse</w:t>
       </w:r>
     </w:p>
     <w:p>
       <w:pPr>
-        <w:widowControl/>
-        <w:rPr>
-          <w:lang w:val="fr-FR"/>
-        </w:rPr>
-      </w:pPr>
-      <w:r>
-        <w:rPr>
-          <w:lang w:val="fr-FR"/>
-        </w:rPr>
-        <w:t>il reçoit sur 24 heures un volume important de contenu digestif et de sécrétions gastriques, biliaires et pancréatiques ; les ordres de grandeur varient selon les sources.</w:t>
-      </w:r>
-    </w:p>
-    <w:p>
-      <w:pPr>
-        <w:widowControl/>
+        <w:rPr>
+          <w:lang w:val="fr-FR"/>
+        </w:rPr>
+      </w:pPr>
+      <w:proofErr w:type="gramStart"/>
+      <w:r>
+        <w:rPr>
+          <w:lang w:val="fr-FR"/>
+        </w:rPr>
+        <w:t>il</w:t>
+      </w:r>
+      <w:proofErr w:type="gramEnd"/>
+      <w:r>
+        <w:rPr>
+          <w:lang w:val="fr-FR"/>
+        </w:rPr>
+        <w:t xml:space="preserve"> reçoit sur 24 heures un volume important de contenu digestif et de sécrétions gastriques, biliaires et pancréatiques ; les ordres de grandeur varient selon les sources.</w:t>
+      </w:r>
+    </w:p>
+    <w:p>
+      <w:pPr>
         <w:rPr>
           <w:lang w:val="fr-FR"/>
         </w:rPr>
@@ -1040,7 +1026,6 @@
     </w:p>
     <w:p>
       <w:pPr>
-        <w:widowControl/>
         <w:rPr>
           <w:lang w:val="fr-FR"/>
         </w:rPr>
@@ -1054,7 +1039,6 @@
     </w:p>
     <w:p>
       <w:pPr>
-        <w:widowControl/>
         <w:rPr>
           <w:lang w:val="fr-FR"/>
         </w:rPr>
@@ -1068,7 +1052,6 @@
     </w:p>
     <w:p>
       <w:pPr>
-        <w:widowControl/>
         <w:rPr>
           <w:lang w:val="fr-FR"/>
         </w:rPr>
@@ -1082,7 +1065,6 @@
     </w:p>
     <w:p>
       <w:pPr>
-        <w:widowControl/>
         <w:rPr>
           <w:lang w:val="fr-FR"/>
         </w:rPr>
@@ -1097,31 +1079,41 @@
     <w:p>
       <w:pPr>
         <w:pStyle w:val="Heading2"/>
-        <w:keepNext/>
-        <w:keepLines/>
         <w:spacing w:before="100" w:after="60"/>
-      </w:pPr>
-      <w:r>
+        <w:rPr>
+          <w:lang w:val="fr-FR"/>
+        </w:rPr>
+      </w:pPr>
+      <w:r>
+        <w:rPr>
+          <w:lang w:val="fr-FR"/>
+        </w:rPr>
         <w:t>7.4. Régulation hormonale</w:t>
       </w:r>
     </w:p>
     <w:p>
       <w:pPr>
-        <w:widowControl/>
-        <w:rPr>
-          <w:lang w:val="fr-FR"/>
-        </w:rPr>
-      </w:pPr>
-      <w:r>
-        <w:rPr>
-          <w:lang w:val="fr-FR"/>
-        </w:rPr>
-        <w:t>la sécrétine contribue à la régulation antiacide et stimule la sécrétion pancréatique bicarbonatée.</w:t>
-      </w:r>
-    </w:p>
-    <w:p>
-      <w:pPr>
-        <w:widowControl/>
+        <w:rPr>
+          <w:lang w:val="fr-FR"/>
+        </w:rPr>
+      </w:pPr>
+      <w:proofErr w:type="gramStart"/>
+      <w:r>
+        <w:rPr>
+          <w:lang w:val="fr-FR"/>
+        </w:rPr>
+        <w:t>la</w:t>
+      </w:r>
+      <w:proofErr w:type="gramEnd"/>
+      <w:r>
+        <w:rPr>
+          <w:lang w:val="fr-FR"/>
+        </w:rPr>
+        <w:t xml:space="preserve"> sécrétine contribue à la régulation antiacide et stimule la sécrétion pancréatique bicarbonatée.</w:t>
+      </w:r>
+    </w:p>
+    <w:p>
+      <w:pPr>
         <w:rPr>
           <w:lang w:val="fr-FR"/>
         </w:rPr>
@@ -1136,33 +1128,43 @@
     <w:p>
       <w:pPr>
         <w:pStyle w:val="Heading2"/>
-        <w:keepNext/>
-        <w:keepLines/>
         <w:spacing w:before="100" w:after="60"/>
-      </w:pPr>
-      <w:r>
+        <w:rPr>
+          <w:lang w:val="fr-FR"/>
+        </w:rPr>
+      </w:pPr>
+      <w:r>
+        <w:rPr>
+          <w:lang w:val="fr-FR"/>
+        </w:rPr>
+        <w:lastRenderedPageBreak/>
         <w:t>7.5. Absorption</w:t>
       </w:r>
     </w:p>
     <w:p>
       <w:pPr>
-        <w:widowControl/>
-        <w:rPr>
-          <w:lang w:val="fr-FR"/>
-        </w:rPr>
-      </w:pPr>
-      <w:r>
-        <w:rPr>
-          <w:lang w:val="fr-FR"/>
-        </w:rPr>
-        <w:t>le duodénum contribue notamment à l’absorption du fer, du calcium et de certains micronutriments ; cette absorption se poursuit ensuite dans le reste de l’intestin grêle.</w:t>
+        <w:rPr>
+          <w:lang w:val="fr-FR"/>
+        </w:rPr>
+      </w:pPr>
+      <w:proofErr w:type="gramStart"/>
+      <w:r>
+        <w:rPr>
+          <w:lang w:val="fr-FR"/>
+        </w:rPr>
+        <w:t>le</w:t>
+      </w:r>
+      <w:proofErr w:type="gramEnd"/>
+      <w:r>
+        <w:rPr>
+          <w:lang w:val="fr-FR"/>
+        </w:rPr>
+        <w:t xml:space="preserve"> duodénum contribue notamment à l’absorption du fer, du calcium et de certains micronutriments ; cette absorption se poursuit ensuite dans le reste de l’intestin grêle.</w:t>
       </w:r>
     </w:p>
     <w:p>
       <w:pPr>
         <w:pStyle w:val="Heading1"/>
-        <w:keepNext/>
-        <w:keepLines/>
         <w:spacing w:before="160" w:after="60"/>
         <w:rPr>
           <w:lang w:val="fr-FR"/>
@@ -1177,7 +1179,6 @@
     </w:p>
     <w:p>
       <w:pPr>
-        <w:widowControl/>
         <w:rPr>
           <w:lang w:val="fr-FR"/>
         </w:rPr>
@@ -1191,7 +1192,6 @@
     </w:p>
     <w:p>
       <w:pPr>
-        <w:widowControl/>
         <w:rPr>
           <w:lang w:val="fr-FR"/>
         </w:rPr>
@@ -1206,8 +1206,6 @@
     <w:p>
       <w:pPr>
         <w:pStyle w:val="Heading2"/>
-        <w:keepNext/>
-        <w:keepLines/>
         <w:spacing w:before="100" w:after="60"/>
         <w:rPr>
           <w:lang w:val="fr-FR"/>
@@ -1222,7 +1220,6 @@
     </w:p>
     <w:p>
       <w:pPr>
-        <w:widowControl/>
         <w:rPr>
           <w:lang w:val="fr-FR"/>
         </w:rPr>
@@ -1236,7 +1233,6 @@
     </w:p>
     <w:p>
       <w:pPr>
-        <w:widowControl/>
         <w:rPr>
           <w:lang w:val="fr-FR"/>
         </w:rPr>
@@ -1250,7 +1246,6 @@
     </w:p>
     <w:p>
       <w:pPr>
-        <w:widowControl/>
         <w:rPr>
           <w:lang w:val="fr-FR"/>
         </w:rPr>
@@ -1264,7 +1259,6 @@
     </w:p>
     <w:p>
       <w:pPr>
-        <w:widowControl/>
         <w:rPr>
           <w:lang w:val="fr-FR"/>
         </w:rPr>
@@ -1278,7 +1272,6 @@
     </w:p>
     <w:p>
       <w:pPr>
-        <w:widowControl/>
         <w:rPr>
           <w:lang w:val="fr-FR"/>
         </w:rPr>
@@ -1292,7 +1285,6 @@
     </w:p>
     <w:p>
       <w:pPr>
-        <w:widowControl/>
         <w:rPr>
           <w:lang w:val="fr-FR"/>
         </w:rPr>
@@ -1306,7 +1298,6 @@
     </w:p>
     <w:p>
       <w:pPr>
-        <w:widowControl/>
         <w:rPr>
           <w:lang w:val="fr-FR"/>
         </w:rPr>
@@ -1320,7 +1311,6 @@
     </w:p>
     <w:p>
       <w:pPr>
-        <w:widowControl/>
         <w:rPr>
           <w:lang w:val="fr-FR"/>
         </w:rPr>
@@ -1335,8 +1325,6 @@
     <w:p>
       <w:pPr>
         <w:pStyle w:val="Heading2"/>
-        <w:keepNext/>
-        <w:keepLines/>
         <w:spacing w:before="100" w:after="60"/>
         <w:rPr>
           <w:lang w:val="fr-FR"/>
@@ -1351,7 +1339,6 @@
     </w:p>
     <w:p>
       <w:pPr>
-        <w:widowControl/>
         <w:rPr>
           <w:lang w:val="fr-FR"/>
         </w:rPr>
@@ -1365,7 +1352,6 @@
     </w:p>
     <w:p>
       <w:pPr>
-        <w:widowControl/>
         <w:rPr>
           <w:lang w:val="fr-FR"/>
         </w:rPr>
@@ -1379,7 +1365,6 @@
     </w:p>
     <w:p>
       <w:pPr>
-        <w:widowControl/>
         <w:rPr>
           <w:lang w:val="fr-FR"/>
         </w:rPr>
@@ -1393,7 +1378,6 @@
     </w:p>
     <w:p>
       <w:pPr>
-        <w:widowControl/>
         <w:rPr>
           <w:lang w:val="fr-FR"/>
         </w:rPr>
@@ -1408,8 +1392,6 @@
     <w:p>
       <w:pPr>
         <w:pStyle w:val="Heading1"/>
-        <w:keepNext/>
-        <w:keepLines/>
         <w:spacing w:before="160" w:after="60"/>
         <w:rPr>
           <w:lang w:val="fr-FR"/>
@@ -1424,7 +1406,6 @@
     </w:p>
     <w:p>
       <w:pPr>
-        <w:widowControl/>
         <w:rPr>
           <w:lang w:val="fr-FR"/>
         </w:rPr>
@@ -1438,7 +1419,6 @@
     </w:p>
     <w:p>
       <w:pPr>
-        <w:widowControl/>
         <w:rPr>
           <w:lang w:val="fr-FR"/>
         </w:rPr>
@@ -1452,7 +1432,6 @@
     </w:p>
     <w:p>
       <w:pPr>
-        <w:widowControl/>
         <w:rPr>
           <w:lang w:val="fr-FR"/>
         </w:rPr>
@@ -1479,7 +1458,6 @@
     </w:p>
     <w:p>
       <w:pPr>
-        <w:widowControl/>
         <w:rPr>
           <w:lang w:val="fr-FR"/>
         </w:rPr>
@@ -1494,8 +1472,6 @@
     <w:p>
       <w:pPr>
         <w:pStyle w:val="Heading1"/>
-        <w:keepNext/>
-        <w:keepLines/>
         <w:spacing w:before="160" w:after="60"/>
         <w:rPr>
           <w:lang w:val="fr-FR"/>
@@ -1505,12 +1481,12 @@
         <w:rPr>
           <w:lang w:val="fr-FR"/>
         </w:rPr>
+        <w:lastRenderedPageBreak/>
         <w:t>10. Relations viscéro-somatiques</w:t>
       </w:r>
     </w:p>
     <w:p>
       <w:pPr>
-        <w:widowControl/>
         <w:rPr>
           <w:lang w:val="fr-FR"/>
         </w:rPr>
@@ -1525,8 +1501,6 @@
     <w:p>
       <w:pPr>
         <w:pStyle w:val="Heading1"/>
-        <w:keepNext/>
-        <w:keepLines/>
         <w:spacing w:before="160" w:after="60"/>
         <w:rPr>
           <w:lang w:val="fr-FR"/>
@@ -1541,7 +1515,6 @@
     </w:p>
     <w:p>
       <w:pPr>
-        <w:widowControl/>
         <w:rPr>
           <w:lang w:val="fr-FR"/>
         </w:rPr>
@@ -1555,7 +1528,6 @@
     </w:p>
     <w:p>
       <w:pPr>
-        <w:widowControl/>
         <w:rPr>
           <w:lang w:val="fr-FR"/>
         </w:rPr>
@@ -1570,8 +1542,6 @@
     <w:p>
       <w:pPr>
         <w:pStyle w:val="Heading1"/>
-        <w:keepNext/>
-        <w:keepLines/>
         <w:spacing w:before="160" w:after="60"/>
         <w:rPr>
           <w:lang w:val="fr-FR"/>
@@ -1586,7 +1556,6 @@
     </w:p>
     <w:p>
       <w:pPr>
-        <w:widowControl/>
         <w:rPr>
           <w:lang w:val="fr-FR"/>
         </w:rPr>
@@ -1627,121 +1596,228 @@
     <w:p>
       <w:pPr>
         <w:pStyle w:val="Heading1"/>
-      </w:pPr>
-      <w:r>
-        <w:t>13. Zones réflexes podales</w:t>
-      </w:r>
-    </w:p>
-    <w:p>
-      <w:pPr>
-        <w:shd w:fill="EEF5F5"/>
+        <w:rPr>
+          <w:lang w:val="fr-FR"/>
+        </w:rPr>
+      </w:pPr>
+      <w:r>
+        <w:rPr>
+          <w:lang w:val="fr-FR"/>
+        </w:rPr>
+        <w:t xml:space="preserve">13. Zones réflexes </w:t>
+      </w:r>
+      <w:r>
+        <w:rPr>
+          <w:lang w:val="fr-FR"/>
+        </w:rPr>
+        <w:t>ROP</w:t>
+      </w:r>
+    </w:p>
+    <w:p>
+      <w:pPr>
+        <w:pStyle w:val="Heading2"/>
+        <w:rPr>
+          <w:lang w:val="fr-FR"/>
+        </w:rPr>
+      </w:pPr>
+      <w:r>
+        <w:rPr>
+          <w:lang w:val="fr-FR"/>
+        </w:rPr>
+        <w:t>13.1. Repères propres au duodénum</w:t>
+      </w:r>
+    </w:p>
+    <w:p>
+      <w:pPr>
+        <w:rPr>
+          <w:lang w:val="fr-FR"/>
+        </w:rPr>
+      </w:pPr>
+      <w:r>
+        <w:rPr>
+          <w:lang w:val="fr-FR"/>
+        </w:rPr>
+        <w:t>La cartographie actuelle D1-D4 est conservée, car elle permet de distinguer les différents segments duodénaux et leurs principaux carrefours fonctionnels.</w:t>
+      </w:r>
+    </w:p>
+    <w:p>
+      <w:pPr>
+        <w:spacing w:after="60"/>
+        <w:rPr>
+          <w:lang w:val="fr-FR"/>
+        </w:rPr>
+      </w:pPr>
+      <w:r>
+        <w:rPr>
+          <w:b/>
+          <w:lang w:val="fr-FR"/>
+        </w:rPr>
+        <w:t xml:space="preserve">Pied droit. </w:t>
+      </w:r>
+      <w:r>
+        <w:rPr>
+          <w:lang w:val="fr-FR"/>
+        </w:rPr>
+        <w:t>D1 est projeté horizontalement autour du repère L1 ; D2 verticalement de L1 à L4 ; le sphincter d’Oddi est repéré à l’union du tiers moyen et du tiers inférieur de D2, autour de L2 ; D3 est projeté horizontalement autour du tubercule du naviculaire.</w:t>
+      </w:r>
+    </w:p>
+    <w:p>
+      <w:pPr>
+        <w:spacing w:after="60"/>
+        <w:rPr>
+          <w:lang w:val="fr-FR"/>
+        </w:rPr>
+      </w:pPr>
+      <w:r>
+        <w:rPr>
+          <w:b/>
+          <w:lang w:val="fr-FR"/>
+        </w:rPr>
+        <w:t xml:space="preserve">Pied gauche. </w:t>
+      </w:r>
+      <w:r>
+        <w:rPr>
+          <w:lang w:val="fr-FR"/>
+        </w:rPr>
+        <w:t xml:space="preserve">D4 est projeté selon une ligne oblique crânio-latérale ; la jonction </w:t>
+      </w:r>
+      <w:proofErr w:type="spellStart"/>
+      <w:r>
+        <w:rPr>
+          <w:lang w:val="fr-FR"/>
+        </w:rPr>
+        <w:t>duodéno-jéjunale</w:t>
+      </w:r>
+      <w:proofErr w:type="spellEnd"/>
+      <w:r>
+        <w:rPr>
+          <w:lang w:val="fr-FR"/>
+        </w:rPr>
+        <w:t xml:space="preserve"> est décrite comme symétrique du sphincter d’Oddi, autour de L2.</w:t>
+      </w:r>
+    </w:p>
+    <w:p>
+      <w:pPr>
+        <w:spacing w:after="60"/>
+        <w:rPr>
+          <w:lang w:val="fr-FR"/>
+        </w:rPr>
+      </w:pPr>
+      <w:r>
+        <w:rPr>
+          <w:b/>
+          <w:lang w:val="fr-FR"/>
+        </w:rPr>
+        <w:t xml:space="preserve">Sur les deux pieds. </w:t>
+      </w:r>
+      <w:r>
+        <w:rPr>
+          <w:lang w:val="fr-FR"/>
+        </w:rPr>
+        <w:t>Le pylore est repéré sur le bord médial de la peau plantaire, généralement plus marqué à droite.</w:t>
+      </w:r>
+    </w:p>
+    <w:p>
+      <w:pPr>
+        <w:rPr>
+          <w:lang w:val="fr-FR"/>
+        </w:rPr>
+      </w:pPr>
+      <w:r>
+        <w:rPr>
+          <w:lang w:val="fr-FR"/>
+        </w:rPr>
+        <w:t xml:space="preserve">Le quadrilatère de </w:t>
+      </w:r>
+      <w:proofErr w:type="spellStart"/>
+      <w:r>
+        <w:rPr>
+          <w:lang w:val="fr-FR"/>
+        </w:rPr>
+        <w:t>Rogié</w:t>
+      </w:r>
+      <w:proofErr w:type="spellEnd"/>
+      <w:r>
+        <w:rPr>
+          <w:lang w:val="fr-FR"/>
+        </w:rPr>
+        <w:t xml:space="preserve"> peut être utilisé comme repère régional associé à D2 lorsque les tests le rendent pertinent. Il ne constitue pas une nouvelle zone d’organe, mais un carrefour clinique de structures solidaires du deuxième duodénum.</w:t>
+      </w:r>
+    </w:p>
+    <w:p>
+      <w:pPr>
+        <w:shd w:val="clear" w:color="auto" w:fill="FFF4D8"/>
         <w:spacing w:before="80" w:after="100"/>
         <w:ind w:left="142" w:right="142"/>
+        <w:rPr>
+          <w:lang w:val="fr-FR"/>
+        </w:rPr>
       </w:pPr>
       <w:r>
         <w:rPr>
           <w:b/>
-        </w:rPr>
-        <w:t xml:space="preserve">PRÉCISION MÉTHODOLOGIQUE — </w:t>
-      </w:r>
-      <w:r>
-        <w:t>Les localisations décrites ci-dessous appartiennent à la cartographie clinique de la ROP. Elles ne constituent pas une projection anatomique directe du duodénum, du sphincter d’Oddi ou de leurs voies nerveuses sur le pied. Pour le duodénum, le protocole associe la zone spécifique D1-D4, la régulation neuro-végétative digestive, l’environnement loco-régional abdominal, puis l’intégration viscéro-somatique et la Balance cerveau limbique-duodénum.</w:t>
+          <w:lang w:val="fr-FR"/>
+        </w:rPr>
+        <w:t xml:space="preserve">PRINCIPE ROP — </w:t>
+      </w:r>
+      <w:r>
+        <w:rPr>
+          <w:lang w:val="fr-FR"/>
+        </w:rPr>
+        <w:t xml:space="preserve">La cartographie D1-D4 constitue la cible propre du duodénum. Pylore, sphincter d’Oddi, quadrilatère de </w:t>
+      </w:r>
+      <w:proofErr w:type="spellStart"/>
+      <w:r>
+        <w:rPr>
+          <w:lang w:val="fr-FR"/>
+        </w:rPr>
+        <w:t>Rogié</w:t>
+      </w:r>
+      <w:proofErr w:type="spellEnd"/>
+      <w:r>
+        <w:rPr>
+          <w:lang w:val="fr-FR"/>
+        </w:rPr>
+        <w:t xml:space="preserve"> et jonction </w:t>
+      </w:r>
+      <w:proofErr w:type="spellStart"/>
+      <w:r>
+        <w:rPr>
+          <w:lang w:val="fr-FR"/>
+        </w:rPr>
+        <w:t>duodéno-jéjunale</w:t>
+      </w:r>
+      <w:proofErr w:type="spellEnd"/>
+      <w:r>
+        <w:rPr>
+          <w:lang w:val="fr-FR"/>
+        </w:rPr>
+        <w:t xml:space="preserve"> sont sélectionnés selon le segment et le tableau clinique.</w:t>
       </w:r>
     </w:p>
     <w:p>
       <w:pPr>
         <w:pStyle w:val="Heading2"/>
-      </w:pPr>
-      <w:r>
-        <w:t>13.1. Repères propres au duodénum</w:t>
-      </w:r>
-    </w:p>
-    <w:p>
-      <w:r>
-        <w:rPr>
-          <w:i w:val="0"/>
-        </w:rPr>
-        <w:t>La cartographie actuelle D1-D4 est conservée, car elle permet de distinguer les différents segments duodénaux et leurs principaux carrefours fonctionnels.</w:t>
-      </w:r>
-    </w:p>
-    <w:p>
-      <w:pPr>
-        <w:spacing w:after="60"/>
-      </w:pPr>
-      <w:r>
-        <w:rPr>
-          <w:b/>
-        </w:rPr>
-        <w:t xml:space="preserve">Pied droit. </w:t>
-      </w:r>
-      <w:r>
-        <w:t>D1 est projeté horizontalement autour du repère L1 ; D2 verticalement de L1 à L4 ; le sphincter d’Oddi est repéré à l’union du tiers moyen et du tiers inférieur de D2, autour de L2 ; D3 est projeté horizontalement autour du tubercule du naviculaire.</w:t>
-      </w:r>
-    </w:p>
-    <w:p>
-      <w:pPr>
-        <w:spacing w:after="60"/>
-      </w:pPr>
-      <w:r>
-        <w:rPr>
-          <w:b/>
-        </w:rPr>
-        <w:t xml:space="preserve">Pied gauche. </w:t>
-      </w:r>
-      <w:r>
-        <w:t>D4 est projeté selon une ligne oblique crânio-latérale ; la jonction duodéno-jéjunale est décrite comme symétrique du sphincter d’Oddi, autour de L2.</w:t>
-      </w:r>
-    </w:p>
-    <w:p>
-      <w:pPr>
-        <w:spacing w:after="60"/>
-      </w:pPr>
-      <w:r>
-        <w:rPr>
-          <w:b/>
-        </w:rPr>
-        <w:t xml:space="preserve">Sur les deux pieds. </w:t>
-      </w:r>
-      <w:r>
-        <w:t>Le pylore est repéré sur le bord médial de la peau plantaire, généralement plus marqué à droite.</w:t>
-      </w:r>
-    </w:p>
-    <w:p>
-      <w:r>
-        <w:rPr>
-          <w:i w:val="0"/>
-        </w:rPr>
-        <w:t>Le quadrilatère de Rogié peut être utilisé comme repère régional associé à D2 lorsque les tests le rendent pertinent. Il ne constitue pas une nouvelle zone d’organe, mais un carrefour clinique de structures solidaires du deuxième duodénum.</w:t>
-      </w:r>
-    </w:p>
-    <w:p>
-      <w:pPr>
-        <w:shd w:fill="FFF4D8"/>
-        <w:spacing w:before="80" w:after="100"/>
-        <w:ind w:left="142" w:right="142"/>
-      </w:pPr>
-      <w:r>
-        <w:rPr>
-          <w:b/>
-        </w:rPr>
-        <w:t xml:space="preserve">PRINCIPE ROP — </w:t>
-      </w:r>
-      <w:r>
-        <w:t>La cartographie D1-D4 constitue la cible propre du duodénum. Pylore, sphincter d’Oddi, quadrilatère de Rogié et jonction duodéno-jéjunale sont sélectionnés selon le segment et le tableau clinique.</w:t>
-      </w:r>
-    </w:p>
-    <w:p>
-      <w:pPr>
-        <w:pStyle w:val="Heading2"/>
-      </w:pPr>
-      <w:r>
+        <w:rPr>
+          <w:lang w:val="fr-FR"/>
+        </w:rPr>
+      </w:pPr>
+      <w:r>
+        <w:rPr>
+          <w:lang w:val="fr-FR"/>
+        </w:rPr>
         <w:t>13.2. Niveau 1 — Régulation des centres supérieurs</w:t>
       </w:r>
     </w:p>
     <w:p>
-      <w:r>
-        <w:rPr>
-          <w:i w:val="0"/>
+      <w:pPr>
+        <w:rPr>
+          <w:lang w:val="fr-FR"/>
+        </w:rPr>
+      </w:pPr>
+      <w:r>
+        <w:rPr>
+          <w:lang w:val="fr-FR"/>
         </w:rPr>
         <w:t>Le Niveau 1 reste court et optionnel. Il peut être intégré lorsque le tableau digestif s’accompagne de stress important, d’anxiété et d’hypervigilance digestive, de perturbations du sommeil ou d’une forte composante émotionnelle.</w:t>
       </w:r>
@@ -1751,12 +1827,15 @@
         <w:pStyle w:val="ListParagraph"/>
         <w:spacing w:after="32"/>
         <w:ind w:left="255" w:hanging="142"/>
-      </w:pPr>
-      <w:r>
-        <w:t xml:space="preserve">• </w:t>
-      </w:r>
-      <w:r>
-        <w:t>Zones réflexes occipitales.</w:t>
+        <w:rPr>
+          <w:lang w:val="fr-FR"/>
+        </w:rPr>
+      </w:pPr>
+      <w:r>
+        <w:rPr>
+          <w:lang w:val="fr-FR"/>
+        </w:rPr>
+        <w:t>• Zones réflexes occipitales.</w:t>
       </w:r>
     </w:p>
     <w:p>
@@ -1764,12 +1843,15 @@
         <w:pStyle w:val="ListParagraph"/>
         <w:spacing w:after="32"/>
         <w:ind w:left="255" w:hanging="142"/>
-      </w:pPr>
-      <w:r>
-        <w:t xml:space="preserve">• </w:t>
-      </w:r>
-      <w:r>
-        <w:t>Tronc cérébral et centres d’intégration.</w:t>
+        <w:rPr>
+          <w:lang w:val="fr-FR"/>
+        </w:rPr>
+      </w:pPr>
+      <w:r>
+        <w:rPr>
+          <w:lang w:val="fr-FR"/>
+        </w:rPr>
+        <w:t>• Tronc cérébral et centres d’intégration.</w:t>
       </w:r>
     </w:p>
     <w:p>
@@ -1777,12 +1859,16 @@
         <w:pStyle w:val="ListParagraph"/>
         <w:spacing w:after="32"/>
         <w:ind w:left="255" w:hanging="142"/>
-      </w:pPr>
-      <w:r>
-        <w:t xml:space="preserve">• </w:t>
-      </w:r>
-      <w:r>
-        <w:t>Hypothalamus.</w:t>
+        <w:rPr>
+          <w:lang w:val="fr-FR"/>
+        </w:rPr>
+      </w:pPr>
+      <w:r>
+        <w:rPr>
+          <w:lang w:val="fr-FR"/>
+        </w:rPr>
+        <w:lastRenderedPageBreak/>
+        <w:t>• Hypothalamus.</w:t>
       </w:r>
     </w:p>
     <w:p>
@@ -1790,54 +1876,78 @@
         <w:pStyle w:val="ListParagraph"/>
         <w:spacing w:after="32"/>
         <w:ind w:left="255" w:hanging="142"/>
-      </w:pPr>
-      <w:r>
-        <w:t xml:space="preserve">• </w:t>
-      </w:r>
-      <w:r>
-        <w:t>Axe hypothalamo-hypophysaire.</w:t>
-      </w:r>
-    </w:p>
-    <w:p>
-      <w:pPr>
-        <w:spacing w:after="80"/>
+        <w:rPr>
+          <w:lang w:val="fr-FR"/>
+        </w:rPr>
+      </w:pPr>
+      <w:r>
+        <w:rPr>
+          <w:lang w:val="fr-FR"/>
+        </w:rPr>
+        <w:t>• Axe hypothalamo-hypophysaire.</w:t>
+      </w:r>
+    </w:p>
+    <w:p>
+      <w:pPr>
+        <w:rPr>
+          <w:lang w:val="fr-FR"/>
+        </w:rPr>
       </w:pPr>
       <w:r>
         <w:rPr>
           <w:i/>
           <w:color w:val="5E666A"/>
+          <w:lang w:val="fr-FR"/>
         </w:rPr>
         <w:t>Cf. chapitre 3 — Système nerveux central.</w:t>
       </w:r>
     </w:p>
     <w:p>
       <w:pPr>
-        <w:shd w:fill="F3EEE4"/>
+        <w:shd w:val="clear" w:color="auto" w:fill="F3EEE4"/>
         <w:spacing w:before="80" w:after="100"/>
         <w:ind w:left="142" w:right="142"/>
+        <w:rPr>
+          <w:lang w:val="fr-FR"/>
+        </w:rPr>
       </w:pPr>
       <w:r>
         <w:rPr>
           <w:b/>
+          <w:lang w:val="fr-FR"/>
         </w:rPr>
         <w:t xml:space="preserve">INTÉRÊT EN ROP — </w:t>
       </w:r>
       <w:r>
-        <w:t>Le Niveau 1 constitue une préparation générale lorsque le contexte central et adaptatif paraît pertinent. Il ne suppose pas une action directe sur un « centre duodénal » cérébral.</w:t>
+        <w:rPr>
+          <w:lang w:val="fr-FR"/>
+        </w:rPr>
+        <w:t xml:space="preserve">Le Niveau 1 constitue une préparation générale lorsque le contexte central et adaptatif paraît pertinent. </w:t>
       </w:r>
     </w:p>
     <w:p>
       <w:pPr>
         <w:pStyle w:val="Heading2"/>
-      </w:pPr>
-      <w:r>
+        <w:rPr>
+          <w:lang w:val="fr-FR"/>
+        </w:rPr>
+      </w:pPr>
+      <w:r>
+        <w:rPr>
+          <w:lang w:val="fr-FR"/>
+        </w:rPr>
         <w:t>13.3. Niveau 2 — Régulation neuro-végétative et adaptation</w:t>
       </w:r>
     </w:p>
     <w:p>
-      <w:r>
-        <w:rPr>
-          <w:i w:val="0"/>
+      <w:pPr>
+        <w:rPr>
+          <w:lang w:val="fr-FR"/>
+        </w:rPr>
+      </w:pPr>
+      <w:r>
+        <w:rPr>
+          <w:lang w:val="fr-FR"/>
         </w:rPr>
         <w:t>Le Niveau 2 est important dans le protocole duodénal. Il associe les voies parasympathiques vagales, les voies sympathiques splanchniques et les plexus prévertébraux impliqués dans la motricité et les sécrétions digestives.</w:t>
       </w:r>
@@ -1847,12 +1957,15 @@
         <w:pStyle w:val="ListParagraph"/>
         <w:spacing w:after="32"/>
         <w:ind w:left="255" w:hanging="142"/>
-      </w:pPr>
-      <w:r>
-        <w:t xml:space="preserve">• </w:t>
-      </w:r>
-      <w:r>
-        <w:t>Nerf vague X.</w:t>
+        <w:rPr>
+          <w:lang w:val="fr-FR"/>
+        </w:rPr>
+      </w:pPr>
+      <w:r>
+        <w:rPr>
+          <w:lang w:val="fr-FR"/>
+        </w:rPr>
+        <w:t>• Nerf vague X.</w:t>
       </w:r>
     </w:p>
     <w:p>
@@ -1860,12 +1973,15 @@
         <w:pStyle w:val="ListParagraph"/>
         <w:spacing w:after="32"/>
         <w:ind w:left="255" w:hanging="142"/>
-      </w:pPr>
-      <w:r>
-        <w:t xml:space="preserve">• </w:t>
-      </w:r>
-      <w:r>
-        <w:t>Sympathique thoracique.</w:t>
+        <w:rPr>
+          <w:lang w:val="fr-FR"/>
+        </w:rPr>
+      </w:pPr>
+      <w:r>
+        <w:rPr>
+          <w:lang w:val="fr-FR"/>
+        </w:rPr>
+        <w:t>• Sympathique thoracique.</w:t>
       </w:r>
     </w:p>
     <w:p>
@@ -1873,12 +1989,15 @@
         <w:pStyle w:val="ListParagraph"/>
         <w:spacing w:after="32"/>
         <w:ind w:left="255" w:hanging="142"/>
-      </w:pPr>
-      <w:r>
-        <w:t xml:space="preserve">• </w:t>
-      </w:r>
-      <w:r>
-        <w:t>Nerfs splanchniques.</w:t>
+        <w:rPr>
+          <w:lang w:val="fr-FR"/>
+        </w:rPr>
+      </w:pPr>
+      <w:r>
+        <w:rPr>
+          <w:lang w:val="fr-FR"/>
+        </w:rPr>
+        <w:t>• Nerfs splanchniques.</w:t>
       </w:r>
     </w:p>
     <w:p>
@@ -1886,12 +2005,15 @@
         <w:pStyle w:val="ListParagraph"/>
         <w:spacing w:after="32"/>
         <w:ind w:left="255" w:hanging="142"/>
-      </w:pPr>
-      <w:r>
-        <w:t xml:space="preserve">• </w:t>
-      </w:r>
-      <w:r>
-        <w:t>Plexus cœliaque.</w:t>
+        <w:rPr>
+          <w:lang w:val="fr-FR"/>
+        </w:rPr>
+      </w:pPr>
+      <w:r>
+        <w:rPr>
+          <w:lang w:val="fr-FR"/>
+        </w:rPr>
+        <w:t>• Plexus cœliaque.</w:t>
       </w:r>
     </w:p>
     <w:p>
@@ -1899,12 +2021,15 @@
         <w:pStyle w:val="ListParagraph"/>
         <w:spacing w:after="32"/>
         <w:ind w:left="255" w:hanging="142"/>
-      </w:pPr>
-      <w:r>
-        <w:t xml:space="preserve">• </w:t>
-      </w:r>
-      <w:r>
-        <w:t>Plexus mésentérique supérieur.</w:t>
+        <w:rPr>
+          <w:lang w:val="fr-FR"/>
+        </w:rPr>
+      </w:pPr>
+      <w:r>
+        <w:rPr>
+          <w:lang w:val="fr-FR"/>
+        </w:rPr>
+        <w:t>• Plexus mésentérique supérieur.</w:t>
       </w:r>
     </w:p>
     <w:p>
@@ -1912,54 +2037,84 @@
         <w:pStyle w:val="ListParagraph"/>
         <w:spacing w:after="32"/>
         <w:ind w:left="255" w:hanging="142"/>
-      </w:pPr>
-      <w:r>
-        <w:t xml:space="preserve">• </w:t>
-      </w:r>
-      <w:r>
-        <w:t>Coordination autonome de la motricité duodénale et des sécrétions digestives.</w:t>
-      </w:r>
-    </w:p>
-    <w:p>
-      <w:pPr>
-        <w:spacing w:after="80"/>
+        <w:rPr>
+          <w:lang w:val="fr-FR"/>
+        </w:rPr>
+      </w:pPr>
+      <w:r>
+        <w:rPr>
+          <w:lang w:val="fr-FR"/>
+        </w:rPr>
+        <w:t>• Coordination autonome de la motricité duodénale et des sécrétions digestives.</w:t>
+      </w:r>
+    </w:p>
+    <w:p>
+      <w:pPr>
+        <w:rPr>
+          <w:lang w:val="fr-FR"/>
+        </w:rPr>
       </w:pPr>
       <w:r>
         <w:rPr>
           <w:i/>
           <w:color w:val="5E666A"/>
+          <w:lang w:val="fr-FR"/>
         </w:rPr>
         <w:t>Cf. chapitre 4 — Système nerveux autonome.</w:t>
       </w:r>
     </w:p>
     <w:p>
       <w:pPr>
-        <w:shd w:fill="F3EEE4"/>
+        <w:shd w:val="clear" w:color="auto" w:fill="F3EEE4"/>
         <w:spacing w:before="80" w:after="100"/>
         <w:ind w:left="142" w:right="142"/>
+        <w:rPr>
+          <w:lang w:val="fr-FR"/>
+        </w:rPr>
       </w:pPr>
       <w:r>
         <w:rPr>
           <w:b/>
+          <w:lang w:val="fr-FR"/>
         </w:rPr>
         <w:t xml:space="preserve">INTÉRÊT EN ROP — </w:t>
       </w:r>
       <w:r>
-        <w:t>Le Niveau 2 vise la coordination neuro-végétative de la motricité duodénale et de la séquence digestive, sans rechercher une stimulation isolée du vague ou du sympathique.</w:t>
+        <w:rPr>
+          <w:lang w:val="fr-FR"/>
+        </w:rPr>
+        <w:t>Le Niveau 2 vise la coordination neuro-végétative de la motricité duodénale et de la séquence digestive</w:t>
+      </w:r>
+      <w:r>
+        <w:rPr>
+          <w:lang w:val="fr-FR"/>
+        </w:rPr>
+        <w:t>.</w:t>
       </w:r>
     </w:p>
     <w:p>
       <w:pPr>
         <w:pStyle w:val="Heading2"/>
-      </w:pPr>
-      <w:r>
+        <w:rPr>
+          <w:lang w:val="fr-FR"/>
+        </w:rPr>
+      </w:pPr>
+      <w:r>
+        <w:rPr>
+          <w:lang w:val="fr-FR"/>
+        </w:rPr>
         <w:t>13.4. Niveau 3 — Régulation viscérale loco-régionale</w:t>
       </w:r>
     </w:p>
     <w:p>
-      <w:r>
-        <w:rPr>
-          <w:i w:val="0"/>
+      <w:pPr>
+        <w:rPr>
+          <w:lang w:val="fr-FR"/>
+        </w:rPr>
+      </w:pPr>
+      <w:r>
+        <w:rPr>
+          <w:lang w:val="fr-FR"/>
         </w:rPr>
         <w:t>Le Niveau 3 constitue le cœur anatomique du protocole. La sélection régionale varie selon le segment duodénal concerné.</w:t>
       </w:r>
@@ -1967,150 +2122,281 @@
     <w:p>
       <w:pPr>
         <w:spacing w:after="60"/>
+        <w:rPr>
+          <w:lang w:val="fr-FR"/>
+        </w:rPr>
       </w:pPr>
       <w:r>
         <w:rPr>
           <w:b/>
+          <w:lang w:val="fr-FR"/>
         </w:rPr>
         <w:t xml:space="preserve">D1 — interface gastro-hépato-duodénale. </w:t>
       </w:r>
       <w:r>
+        <w:rPr>
+          <w:lang w:val="fr-FR"/>
+        </w:rPr>
         <w:t>Selon les tests : pylore, D1, estomac, foie, vésicule biliaire et ligament hépato-duodénal.</w:t>
       </w:r>
     </w:p>
     <w:p>
       <w:pPr>
         <w:spacing w:after="60"/>
+        <w:rPr>
+          <w:lang w:val="fr-FR"/>
+        </w:rPr>
       </w:pPr>
       <w:r>
         <w:rPr>
           <w:b/>
+          <w:lang w:val="fr-FR"/>
         </w:rPr>
         <w:t xml:space="preserve">D2 — carrefour bilio-pancréatique. </w:t>
       </w:r>
       <w:r>
-        <w:t>D2, tête du pancréas, papille majeure, sphincter d’Oddi, papille mineure, voies biliaires et quadrilatère de Rogié. Le rein droit et le côlon ascendant ne sont ajoutés que si les tests les rendent pertinents.</w:t>
+        <w:rPr>
+          <w:lang w:val="fr-FR"/>
+        </w:rPr>
+        <w:t xml:space="preserve">D2, tête du pancréas, papille majeure, sphincter d’Oddi, papille mineure, voies biliaires et quadrilatère de </w:t>
+      </w:r>
+      <w:proofErr w:type="spellStart"/>
+      <w:r>
+        <w:rPr>
+          <w:lang w:val="fr-FR"/>
+        </w:rPr>
+        <w:t>Rogié</w:t>
+      </w:r>
+      <w:proofErr w:type="spellEnd"/>
+      <w:r>
+        <w:rPr>
+          <w:lang w:val="fr-FR"/>
+        </w:rPr>
+        <w:t>. Le rein droit et le côlon ascendant ne sont ajoutés que si les tests les rendent pertinents.</w:t>
       </w:r>
     </w:p>
     <w:p>
       <w:pPr>
         <w:spacing w:after="60"/>
+        <w:rPr>
+          <w:lang w:val="fr-FR"/>
+        </w:rPr>
       </w:pPr>
       <w:r>
         <w:rPr>
           <w:b/>
+          <w:lang w:val="fr-FR"/>
         </w:rPr>
         <w:t xml:space="preserve">D3-D4 — interface mésentérique. </w:t>
       </w:r>
       <w:r>
-        <w:t>D3, D4, racine du mésentère, vaisseaux mésentériques supérieurs, jonction duodéno-jéjunale, muscle de Treitz et début du jéjunum.</w:t>
-      </w:r>
-    </w:p>
-    <w:p>
-      <w:pPr>
-        <w:spacing w:after="80"/>
+        <w:rPr>
+          <w:lang w:val="fr-FR"/>
+        </w:rPr>
+        <w:t xml:space="preserve">D3, D4, racine du mésentère, vaisseaux mésentériques supérieurs, jonction </w:t>
+      </w:r>
+      <w:proofErr w:type="spellStart"/>
+      <w:r>
+        <w:rPr>
+          <w:lang w:val="fr-FR"/>
+        </w:rPr>
+        <w:t>duodéno-jéjunale</w:t>
+      </w:r>
+      <w:proofErr w:type="spellEnd"/>
+      <w:r>
+        <w:rPr>
+          <w:lang w:val="fr-FR"/>
+        </w:rPr>
+        <w:t>, muscle de Treitz et début du jéjunum.</w:t>
+      </w:r>
+    </w:p>
+    <w:p>
+      <w:pPr>
+        <w:rPr>
+          <w:lang w:val="fr-FR"/>
+        </w:rPr>
       </w:pPr>
       <w:r>
         <w:rPr>
           <w:i/>
           <w:color w:val="5E666A"/>
+          <w:lang w:val="fr-FR"/>
         </w:rPr>
         <w:t>Cf. chapitre 7 — Socle régional abdominal et péritonéal ; chapitre 11 — Foie et voies biliaires ; chapitre 12 — Pancréas ; chapitre 14 — Intestin grêle.</w:t>
       </w:r>
     </w:p>
     <w:p>
       <w:pPr>
-        <w:shd w:fill="F3EEE4"/>
+        <w:shd w:val="clear" w:color="auto" w:fill="F3EEE4"/>
         <w:spacing w:before="80" w:after="100"/>
         <w:ind w:left="142" w:right="142"/>
+        <w:rPr>
+          <w:lang w:val="fr-FR"/>
+        </w:rPr>
       </w:pPr>
       <w:r>
         <w:rPr>
           <w:b/>
+          <w:lang w:val="fr-FR"/>
         </w:rPr>
         <w:t xml:space="preserve">INTÉRÊT EN ROP — </w:t>
       </w:r>
       <w:r>
+        <w:rPr>
+          <w:lang w:val="fr-FR"/>
+        </w:rPr>
         <w:t>Le Niveau 3 permet de choisir les interfaces correspondant au segment duodénal concerné. Il n’impose pas de traiter systématiquement estomac, foie, pancréas et intestin à chaque séance.</w:t>
       </w:r>
     </w:p>
     <w:p>
       <w:pPr>
         <w:pStyle w:val="Heading2"/>
-      </w:pPr>
-      <w:r>
-        <w:t>13.5. Niveau 4 — Intégration viscéro-somatique et Balance cerveau limbique-duodénum</w:t>
+        <w:rPr>
+          <w:lang w:val="fr-FR"/>
+        </w:rPr>
+      </w:pPr>
+      <w:r>
+        <w:rPr>
+          <w:lang w:val="fr-FR"/>
+        </w:rPr>
+        <w:t xml:space="preserve">13.5. Niveau 4 — Intégration </w:t>
+      </w:r>
+      <w:proofErr w:type="spellStart"/>
+      <w:r>
+        <w:rPr>
+          <w:lang w:val="fr-FR"/>
+        </w:rPr>
+        <w:t>viscéro</w:t>
+      </w:r>
+      <w:proofErr w:type="spellEnd"/>
+      <w:r>
+        <w:rPr>
+          <w:lang w:val="fr-FR"/>
+        </w:rPr>
+        <w:t>-somatique et Balance cerveau limbique-duodénum</w:t>
       </w:r>
     </w:p>
     <w:p>
       <w:pPr>
         <w:spacing w:after="60"/>
+        <w:rPr>
+          <w:lang w:val="fr-FR"/>
+        </w:rPr>
       </w:pPr>
       <w:r>
         <w:rPr>
           <w:b/>
-        </w:rPr>
-        <w:t xml:space="preserve">Versant viscéro-somatique. </w:t>
-      </w:r>
-      <w:r>
+          <w:lang w:val="fr-FR"/>
+        </w:rPr>
+        <w:t xml:space="preserve">Versant </w:t>
+      </w:r>
+      <w:proofErr w:type="spellStart"/>
+      <w:r>
+        <w:rPr>
+          <w:b/>
+          <w:lang w:val="fr-FR"/>
+        </w:rPr>
+        <w:t>viscéro</w:t>
+      </w:r>
+      <w:proofErr w:type="spellEnd"/>
+      <w:r>
+        <w:rPr>
+          <w:b/>
+          <w:lang w:val="fr-FR"/>
+        </w:rPr>
+        <w:t xml:space="preserve">-somatique. </w:t>
+      </w:r>
+      <w:r>
+        <w:rPr>
+          <w:lang w:val="fr-FR"/>
+        </w:rPr>
         <w:t>Selon les tests, la lecture peut intégrer Th7-Th9, L1-L2, les dernières côtes, la charnière thoraco-lombaire, les piliers du diaphragme, le psoas et la paroi abdominale postérieure.</w:t>
       </w:r>
     </w:p>
     <w:p>
       <w:pPr>
         <w:spacing w:after="60"/>
+        <w:rPr>
+          <w:lang w:val="fr-FR"/>
+        </w:rPr>
       </w:pPr>
       <w:r>
         <w:rPr>
           <w:b/>
+          <w:lang w:val="fr-FR"/>
         </w:rPr>
         <w:t xml:space="preserve">Balance cerveau limbique-duodénum. </w:t>
       </w:r>
       <w:r>
+        <w:rPr>
+          <w:lang w:val="fr-FR"/>
+        </w:rPr>
         <w:t>Dans le vocabulaire propre à la ROP, l’écoute-induction associe un repère duodénal et un repère du cerveau limbique.</w:t>
       </w:r>
     </w:p>
     <w:p>
-      <w:r>
-        <w:rPr>
-          <w:i w:val="0"/>
+      <w:pPr>
+        <w:rPr>
+          <w:lang w:val="fr-FR"/>
+        </w:rPr>
+      </w:pPr>
+      <w:r>
+        <w:rPr>
+          <w:lang w:val="fr-FR"/>
         </w:rPr>
         <w:t>Cette « balance » constitue une technique clinique d’intégration propre à la ROP. Elle ne décrit pas une connexion anatomique directe entre la zone podale, les réseaux limbiques et le duodénum.</w:t>
       </w:r>
     </w:p>
     <w:p>
       <w:pPr>
-        <w:spacing w:after="80"/>
+        <w:rPr>
+          <w:lang w:val="fr-FR"/>
+        </w:rPr>
       </w:pPr>
       <w:r>
         <w:rPr>
           <w:i/>
           <w:color w:val="5E666A"/>
+          <w:lang w:val="fr-FR"/>
         </w:rPr>
         <w:t>Cf. chapitre 3 — Système nerveux central ; cf. chapitre 5 — Mécanisme de stress.</w:t>
       </w:r>
     </w:p>
     <w:p>
       <w:pPr>
-        <w:shd w:fill="F3EEE4"/>
+        <w:shd w:val="clear" w:color="auto" w:fill="F3EEE4"/>
         <w:spacing w:before="80" w:after="100"/>
         <w:ind w:left="142" w:right="142"/>
+        <w:rPr>
+          <w:lang w:val="fr-FR"/>
+        </w:rPr>
       </w:pPr>
       <w:r>
         <w:rPr>
           <w:b/>
-        </w:rPr>
+          <w:lang w:val="fr-FR"/>
+        </w:rPr>
+        <w:lastRenderedPageBreak/>
         <w:t xml:space="preserve">INTÉRÊT EN ROP — </w:t>
       </w:r>
       <w:r>
+        <w:rPr>
+          <w:lang w:val="fr-FR"/>
+        </w:rPr>
         <w:t>Le Niveau 4 associe les convergences somatiques et la dimension émotionnelle propre à la méthode, tout en distinguant clairement le vocabulaire clinique ROP des mécanismes anatomiques démontrés.</w:t>
       </w:r>
     </w:p>
     <w:p>
       <w:pPr>
         <w:pStyle w:val="Heading2"/>
-      </w:pPr>
-      <w:r>
+        <w:rPr>
+          <w:lang w:val="fr-FR"/>
+        </w:rPr>
+      </w:pPr>
+      <w:r>
+        <w:rPr>
+          <w:lang w:val="fr-FR"/>
+        </w:rPr>
         <w:t>13.6. Soutiens associés selon les tests</w:t>
       </w:r>
     </w:p>
@@ -2119,12 +2405,15 @@
         <w:pStyle w:val="ListParagraph"/>
         <w:spacing w:after="32"/>
         <w:ind w:left="255" w:hanging="142"/>
-      </w:pPr>
-      <w:r>
-        <w:t xml:space="preserve">• </w:t>
-      </w:r>
-      <w:r>
-        <w:t>Estomac : D1 et pylore.</w:t>
+        <w:rPr>
+          <w:lang w:val="fr-FR"/>
+        </w:rPr>
+      </w:pPr>
+      <w:r>
+        <w:rPr>
+          <w:lang w:val="fr-FR"/>
+        </w:rPr>
+        <w:t>• Estomac : D1 et pylore.</w:t>
       </w:r>
     </w:p>
     <w:p>
@@ -2132,12 +2421,15 @@
         <w:pStyle w:val="ListParagraph"/>
         <w:spacing w:after="32"/>
         <w:ind w:left="255" w:hanging="142"/>
-      </w:pPr>
-      <w:r>
-        <w:t xml:space="preserve">• </w:t>
-      </w:r>
-      <w:r>
-        <w:t>Foie, vésicule et voies biliaires : D1-D2 et sphincter d’Oddi.</w:t>
+        <w:rPr>
+          <w:lang w:val="fr-FR"/>
+        </w:rPr>
+      </w:pPr>
+      <w:r>
+        <w:rPr>
+          <w:lang w:val="fr-FR"/>
+        </w:rPr>
+        <w:t>• Foie, vésicule et voies biliaires : D1-D2 et sphincter d’Oddi.</w:t>
       </w:r>
     </w:p>
     <w:p>
@@ -2145,12 +2437,15 @@
         <w:pStyle w:val="ListParagraph"/>
         <w:spacing w:after="32"/>
         <w:ind w:left="255" w:hanging="142"/>
-      </w:pPr>
-      <w:r>
-        <w:t xml:space="preserve">• </w:t>
-      </w:r>
-      <w:r>
-        <w:t>Pancréas : surtout D2.</w:t>
+        <w:rPr>
+          <w:lang w:val="fr-FR"/>
+        </w:rPr>
+      </w:pPr>
+      <w:r>
+        <w:rPr>
+          <w:lang w:val="fr-FR"/>
+        </w:rPr>
+        <w:t>• Pancréas : surtout D2.</w:t>
       </w:r>
     </w:p>
     <w:p>
@@ -2158,12 +2453,29 @@
         <w:pStyle w:val="ListParagraph"/>
         <w:spacing w:after="32"/>
         <w:ind w:left="255" w:hanging="142"/>
-      </w:pPr>
-      <w:r>
-        <w:t xml:space="preserve">• </w:t>
-      </w:r>
-      <w:r>
-        <w:t>Intestin grêle et racine du mésentère : D3-D4 et jonction duodéno-jéjunale.</w:t>
+        <w:rPr>
+          <w:lang w:val="fr-FR"/>
+        </w:rPr>
+      </w:pPr>
+      <w:r>
+        <w:rPr>
+          <w:lang w:val="fr-FR"/>
+        </w:rPr>
+        <w:t xml:space="preserve">• Intestin grêle et racine du mésentère : D3-D4 et jonction </w:t>
+      </w:r>
+      <w:proofErr w:type="spellStart"/>
+      <w:r>
+        <w:rPr>
+          <w:lang w:val="fr-FR"/>
+        </w:rPr>
+        <w:t>duodéno-jéjunale</w:t>
+      </w:r>
+      <w:proofErr w:type="spellEnd"/>
+      <w:r>
+        <w:rPr>
+          <w:lang w:val="fr-FR"/>
+        </w:rPr>
+        <w:t>.</w:t>
       </w:r>
     </w:p>
     <w:p>
@@ -2171,12 +2483,15 @@
         <w:pStyle w:val="ListParagraph"/>
         <w:spacing w:after="32"/>
         <w:ind w:left="255" w:hanging="142"/>
-      </w:pPr>
-      <w:r>
-        <w:t xml:space="preserve">• </w:t>
-      </w:r>
-      <w:r>
-        <w:t>Rein droit : rapport régional de D2.</w:t>
+        <w:rPr>
+          <w:lang w:val="fr-FR"/>
+        </w:rPr>
+      </w:pPr>
+      <w:r>
+        <w:rPr>
+          <w:lang w:val="fr-FR"/>
+        </w:rPr>
+        <w:t>• Rein droit : rapport régional de D2.</w:t>
       </w:r>
     </w:p>
     <w:p>
@@ -2184,18 +2499,26 @@
         <w:pStyle w:val="ListParagraph"/>
         <w:spacing w:after="32"/>
         <w:ind w:left="255" w:hanging="142"/>
-      </w:pPr>
-      <w:r>
-        <w:t xml:space="preserve">• </w:t>
-      </w:r>
-      <w:r>
-        <w:t>Diaphragme : lorsque les interfaces thoraco-abdominales sont pertinentes.</w:t>
-      </w:r>
-    </w:p>
-    <w:p>
-      <w:r>
-        <w:rPr>
-          <w:i w:val="0"/>
+        <w:rPr>
+          <w:lang w:val="fr-FR"/>
+        </w:rPr>
+      </w:pPr>
+      <w:r>
+        <w:rPr>
+          <w:lang w:val="fr-FR"/>
+        </w:rPr>
+        <w:t>• Diaphragme : lorsque les interfaces thoraco-abdominales sont pertinentes.</w:t>
+      </w:r>
+    </w:p>
+    <w:p>
+      <w:pPr>
+        <w:rPr>
+          <w:lang w:val="fr-FR"/>
+        </w:rPr>
+      </w:pPr>
+      <w:r>
+        <w:rPr>
+          <w:lang w:val="fr-FR"/>
         </w:rPr>
         <w:t>Ces territoires sont des soutiens régionaux ou fonctionnels et non une séquence obligatoire.</w:t>
       </w:r>
@@ -2203,8 +2526,14 @@
     <w:p>
       <w:pPr>
         <w:pStyle w:val="Heading2"/>
-      </w:pPr>
-      <w:r>
+        <w:rPr>
+          <w:lang w:val="fr-FR"/>
+        </w:rPr>
+      </w:pPr>
+      <w:r>
+        <w:rPr>
+          <w:lang w:val="fr-FR"/>
+        </w:rPr>
         <w:t>13.7. Lecture clinique</w:t>
       </w:r>
     </w:p>
@@ -2213,12 +2542,29 @@
         <w:pStyle w:val="ListParagraph"/>
         <w:spacing w:after="32"/>
         <w:ind w:left="255" w:hanging="142"/>
-      </w:pPr>
-      <w:r>
-        <w:t xml:space="preserve">• </w:t>
-      </w:r>
-      <w:r>
-        <w:t>Digestion lente ou stase duodénale fonctionnelle : Niveau 2 + segment duodénal concerné au Niveau 3 + pylore ou jonction duodéno-jéjunale selon les tests.</w:t>
+        <w:rPr>
+          <w:lang w:val="fr-FR"/>
+        </w:rPr>
+      </w:pPr>
+      <w:r>
+        <w:rPr>
+          <w:lang w:val="fr-FR"/>
+        </w:rPr>
+        <w:t xml:space="preserve">• Digestion lente ou stase duodénale fonctionnelle : Niveau 2 + segment duodénal concerné au Niveau 3 + pylore ou jonction </w:t>
+      </w:r>
+      <w:proofErr w:type="spellStart"/>
+      <w:r>
+        <w:rPr>
+          <w:lang w:val="fr-FR"/>
+        </w:rPr>
+        <w:t>duodéno-jéjunale</w:t>
+      </w:r>
+      <w:proofErr w:type="spellEnd"/>
+      <w:r>
+        <w:rPr>
+          <w:lang w:val="fr-FR"/>
+        </w:rPr>
+        <w:t xml:space="preserve"> selon les tests.</w:t>
       </w:r>
     </w:p>
     <w:p>
@@ -2226,12 +2572,15 @@
         <w:pStyle w:val="ListParagraph"/>
         <w:spacing w:after="32"/>
         <w:ind w:left="255" w:hanging="142"/>
-      </w:pPr>
-      <w:r>
-        <w:t xml:space="preserve">• </w:t>
-      </w:r>
-      <w:r>
-        <w:t>Contexte bilio-pancréatique fonctionnel : D2 + sphincter d’Oddi + foie/vésicule + pancréas.</w:t>
+        <w:rPr>
+          <w:lang w:val="fr-FR"/>
+        </w:rPr>
+      </w:pPr>
+      <w:r>
+        <w:rPr>
+          <w:lang w:val="fr-FR"/>
+        </w:rPr>
+        <w:t>• Contexte bilio-pancréatique fonctionnel : D2 + sphincter d’Oddi + foie/vésicule + pancréas.</w:t>
       </w:r>
     </w:p>
     <w:p>
@@ -2239,34 +2588,44 @@
         <w:pStyle w:val="ListParagraph"/>
         <w:spacing w:after="32"/>
         <w:ind w:left="255" w:hanging="142"/>
-      </w:pPr>
-      <w:r>
-        <w:t xml:space="preserve">• </w:t>
-      </w:r>
-      <w:r>
-        <w:t>Contexte de tension autour de D3-D4 ou de l’angle de Treitz après exclusion médicale : D3-D4 + racine du mésentère + muscle de Treitz + socle régional du chapitre 7.</w:t>
-      </w:r>
-    </w:p>
-    <w:p>
-      <w:pPr>
-        <w:shd w:fill="F8E9E5"/>
+        <w:rPr>
+          <w:lang w:val="fr-FR"/>
+        </w:rPr>
+      </w:pPr>
+      <w:r>
+        <w:rPr>
+          <w:lang w:val="fr-FR"/>
+        </w:rPr>
+        <w:t>• Contexte de tension autour de D3-D4 ou de l’angle de Treitz après exclusion médicale : D3-D4 + racine du mésentère + muscle de Treitz + socle régional du chapitre 7.</w:t>
+      </w:r>
+    </w:p>
+    <w:p>
+      <w:pPr>
+        <w:shd w:val="clear" w:color="auto" w:fill="F8E9E5"/>
         <w:spacing w:before="80" w:after="100"/>
         <w:ind w:left="142" w:right="142"/>
+        <w:rPr>
+          <w:lang w:val="fr-FR"/>
+        </w:rPr>
       </w:pPr>
       <w:r>
         <w:rPr>
           <w:b/>
+          <w:lang w:val="fr-FR"/>
         </w:rPr>
         <w:t xml:space="preserve">PRINCIPE DE SÉCURITÉ — </w:t>
       </w:r>
       <w:r>
+        <w:rPr>
+          <w:lang w:val="fr-FR"/>
+        </w:rPr>
         <w:t>Douleur épigastrique intense ou persistante, hémorragie digestive, selles noires, vomissements répétés, amaigrissement inexpliqué ou douleur aiguë transfixiante nécessitent une évaluation médicale. La ROP ne remplace pas le diagnostic ni la prise en charge d’une pathologie duodénale.</w:t>
       </w:r>
     </w:p>
     <w:sectPr>
-      <w:footerReference w:type="default" r:id="rId8"/>
-      <w:footerReference w:type="first" r:id="rId11"/>
-      <w:footerReference w:type="even" r:id="rId12"/>
+      <w:footerReference w:type="even" r:id="rId8"/>
+      <w:footerReference w:type="default" r:id="rId9"/>
+      <w:footerReference w:type="first" r:id="rId10"/>
       <w:pgSz w:w="12240" w:h="15840"/>
       <w:pgMar w:top="1134" w:right="1247" w:bottom="1134" w:left="1247" w:header="720" w:footer="720" w:gutter="0"/>
       <w:cols w:space="720"/>
@@ -2302,6 +2661,16 @@
 </file>
 
 <file path=word/footer1.xml><?xml version="1.0" encoding="utf-8"?>
+<w:ftr xmlns:wpc="http://schemas.microsoft.com/office/word/2010/wordprocessingCanvas" xmlns:cx="http://schemas.microsoft.com/office/drawing/2014/chartex" xmlns:cx1="http://schemas.microsoft.com/office/drawing/2015/9/8/chartex" xmlns:cx2="http://schemas.microsoft.com/office/drawing/2015/10/21/chartex" xmlns:cx3="http://schemas.microsoft.com/office/drawing/2016/5/9/chartex" xmlns:cx4="http://schemas.microsoft.com/office/drawing/2016/5/10/chartex" xmlns:cx5="http://schemas.microsoft.com/office/drawing/2016/5/11/chartex" xmlns:cx6="http://schemas.microsoft.com/office/drawing/2016/5/12/chartex" xmlns:cx7="http://schemas.microsoft.com/office/drawing/2016/5/13/chartex" xmlns:cx8="http://schemas.microsoft.com/office/drawing/2016/5/14/chartex" xmlns:mc="http://schemas.openxmlformats.org/markup-compatibility/2006" xmlns:aink="http://schemas.microsoft.com/office/drawing/2016/ink" xmlns:am3d="http://schemas.microsoft.com/office/drawing/2017/model3d" xmlns:o="urn:schemas-microsoft-com:office:office" xmlns:oel="http://schemas.microsoft.com/office/2019/extlst" xmlns:r="http://schemas.openxmlformats.org/officeDocument/2006/relationships" xmlns:m="http://schemas.openxmlformats.org/officeDocument/2006/math" xmlns:v="urn:schemas-microsoft-com:vml" xmlns:wp14="http://schemas.microsoft.com/office/word/2010/wordprocessingDrawing" xmlns:wp="http://schemas.openxmlformats.org/drawingml/2006/wordprocessingDrawing" xmlns:w10="urn:schemas-microsoft-com:office:word" xmlns:w="http://schemas.openxmlformats.org/wordprocessingml/2006/main" xmlns:w14="http://schemas.microsoft.com/office/word/2010/wordml" xmlns:w15="http://schemas.microsoft.com/office/word/2012/wordml" xmlns:w16cex="http://schemas.microsoft.com/office/word/2018/wordml/cex" xmlns:w16cid="http://schemas.microsoft.com/office/word/2016/wordml/cid" xmlns:w16="http://schemas.microsoft.com/office/word/2018/wordml" xmlns:w16du="http://schemas.microsoft.com/office/word/2023/wordml/word16du" xmlns:w16sdtdh="http://schemas.microsoft.com/office/word/2020/wordml/sdtdatahash" xmlns:w16sdtfl="http://schemas.microsoft.com/office/word/2024/wordml/sdtformatlock" xmlns:w16se="http://schemas.microsoft.com/office/word/2015/wordml/symex" xmlns:wpg="http://schemas.microsoft.com/office/word/2010/wordprocessingGroup" xmlns:wpi="http://schemas.microsoft.com/office/word/2010/wordprocessingInk" xmlns:wne="http://schemas.microsoft.com/office/word/2006/wordml" xmlns:wps="http://schemas.microsoft.com/office/word/2010/wordprocessingShape" mc:Ignorable="w14 w15 w16se w16cid w16 w16cex w16sdtdh w16sdtfl w16du wp14">
+  <w:p>
+    <w:pPr>
+      <w:pStyle w:val="Footer"/>
+    </w:pPr>
+  </w:p>
+</w:ftr>
+</file>
+
+<file path=word/footer2.xml><?xml version="1.0" encoding="utf-8"?>
 <w:ftr xmlns:wpc="http://schemas.microsoft.com/office/word/2010/wordprocessingCanvas" xmlns:cx="http://schemas.microsoft.com/office/drawing/2014/chartex" xmlns:cx1="http://schemas.microsoft.com/office/drawing/2015/9/8/chartex" xmlns:cx2="http://schemas.microsoft.com/office/drawing/2015/10/21/chartex" xmlns:cx3="http://schemas.microsoft.com/office/drawing/2016/5/9/chartex" xmlns:cx4="http://schemas.microsoft.com/office/drawing/2016/5/10/chartex" xmlns:cx5="http://schemas.microsoft.com/office/drawing/2016/5/11/chartex" xmlns:cx6="http://schemas.microsoft.com/office/drawing/2016/5/12/chartex" xmlns:cx7="http://schemas.microsoft.com/office/drawing/2016/5/13/chartex" xmlns:cx8="http://schemas.microsoft.com/office/drawing/2016/5/14/chartex" xmlns:mc="http://schemas.openxmlformats.org/markup-compatibility/2006" xmlns:aink="http://schemas.microsoft.com/office/drawing/2016/ink" xmlns:am3d="http://schemas.microsoft.com/office/drawing/2017/model3d" xmlns:o="urn:schemas-microsoft-com:office:office" xmlns:oel="http://schemas.microsoft.com/office/2019/extlst" xmlns:r="http://schemas.openxmlformats.org/officeDocument/2006/relationships" xmlns:m="http://schemas.openxmlformats.org/officeDocument/2006/math" xmlns:v="urn:schemas-microsoft-com:vml" xmlns:wp14="http://schemas.microsoft.com/office/word/2010/wordprocessingDrawing" xmlns:wp="http://schemas.openxmlformats.org/drawingml/2006/wordprocessingDrawing" xmlns:w10="urn:schemas-microsoft-com:office:word" xmlns:w="http://schemas.openxmlformats.org/wordprocessingml/2006/main" xmlns:w14="http://schemas.microsoft.com/office/word/2010/wordml" xmlns:w15="http://schemas.microsoft.com/office/word/2012/wordml" xmlns:w16cex="http://schemas.microsoft.com/office/word/2018/wordml/cex" xmlns:w16cid="http://schemas.microsoft.com/office/word/2016/wordml/cid" xmlns:w16="http://schemas.microsoft.com/office/word/2018/wordml" xmlns:w16du="http://schemas.microsoft.com/office/word/2023/wordml/word16du" xmlns:w16sdtdh="http://schemas.microsoft.com/office/word/2020/wordml/sdtdatahash" xmlns:w16sdtfl="http://schemas.microsoft.com/office/word/2024/wordml/sdtformatlock" xmlns:w16se="http://schemas.microsoft.com/office/word/2015/wordml/symex" xmlns:wpg="http://schemas.microsoft.com/office/word/2010/wordprocessingGroup" xmlns:wpi="http://schemas.microsoft.com/office/word/2010/wordprocessingInk" xmlns:wne="http://schemas.microsoft.com/office/word/2006/wordml" xmlns:wps="http://schemas.microsoft.com/office/word/2010/wordprocessingShape" mc:Ignorable="w14 w15 w16se w16cid w16 w16cex w16sdtdh w16sdtfl w16du wp14">
   <w:p>
     <w:pPr>
@@ -2333,18 +2702,8 @@
 </w:ftr>
 </file>
 
-<file path=word/footer2.xml><?xml version="1.0" encoding="utf-8"?>
-<w:ftr xmlns:m="http://schemas.openxmlformats.org/officeDocument/2006/math" xmlns:mc="http://schemas.openxmlformats.org/markup-compatibility/2006" xmlns:mo="http://schemas.microsoft.com/office/mac/office/2008/main" xmlns:mv="urn:schemas-microsoft-com:mac:vml" xmlns:o="urn:schemas-microsoft-com:office:office" xmlns:r="http://schemas.openxmlformats.org/officeDocument/2006/relationships" xmlns:v="urn:schemas-microsoft-com:vml" xmlns:w10="urn:schemas-microsoft-com:office:word" xmlns:w14="http://schemas.microsoft.com/office/word/2010/wordml" xmlns:w="http://schemas.openxmlformats.org/wordprocessingml/2006/main" xmlns:wne="http://schemas.microsoft.com/office/word/2006/wordml" xmlns:wp14="http://schemas.microsoft.com/office/word/2010/wordprocessingDrawing" xmlns:wp="http://schemas.openxmlformats.org/drawingml/2006/wordprocessingDrawing" xmlns:wpc="http://schemas.microsoft.com/office/word/2010/wordprocessingCanvas" xmlns:wpg="http://schemas.microsoft.com/office/word/2010/wordprocessingGroup" xmlns:wpi="http://schemas.microsoft.com/office/word/2010/wordprocessingInk" xmlns:wps="http://schemas.microsoft.com/office/word/2010/wordprocessingShape" mc:Ignorable="w14 wp14">
-  <w:p>
-    <w:pPr>
-      <w:pStyle w:val="Footer"/>
-    </w:pPr>
-  </w:p>
-</w:ftr>
-</file>
-
 <file path=word/footer3.xml><?xml version="1.0" encoding="utf-8"?>
-<w:ftr xmlns:m="http://schemas.openxmlformats.org/officeDocument/2006/math" xmlns:mc="http://schemas.openxmlformats.org/markup-compatibility/2006" xmlns:mo="http://schemas.microsoft.com/office/mac/office/2008/main" xmlns:mv="urn:schemas-microsoft-com:mac:vml" xmlns:o="urn:schemas-microsoft-com:office:office" xmlns:r="http://schemas.openxmlformats.org/officeDocument/2006/relationships" xmlns:v="urn:schemas-microsoft-com:vml" xmlns:w10="urn:schemas-microsoft-com:office:word" xmlns:w14="http://schemas.microsoft.com/office/word/2010/wordml" xmlns:w="http://schemas.openxmlformats.org/wordprocessingml/2006/main" xmlns:wne="http://schemas.microsoft.com/office/word/2006/wordml" xmlns:wp14="http://schemas.microsoft.com/office/word/2010/wordprocessingDrawing" xmlns:wp="http://schemas.openxmlformats.org/drawingml/2006/wordprocessingDrawing" xmlns:wpc="http://schemas.microsoft.com/office/word/2010/wordprocessingCanvas" xmlns:wpg="http://schemas.microsoft.com/office/word/2010/wordprocessingGroup" xmlns:wpi="http://schemas.microsoft.com/office/word/2010/wordprocessingInk" xmlns:wps="http://schemas.microsoft.com/office/word/2010/wordprocessingShape" mc:Ignorable="w14 wp14">
+<w:ftr xmlns:wpc="http://schemas.microsoft.com/office/word/2010/wordprocessingCanvas" xmlns:cx="http://schemas.microsoft.com/office/drawing/2014/chartex" xmlns:cx1="http://schemas.microsoft.com/office/drawing/2015/9/8/chartex" xmlns:cx2="http://schemas.microsoft.com/office/drawing/2015/10/21/chartex" xmlns:cx3="http://schemas.microsoft.com/office/drawing/2016/5/9/chartex" xmlns:cx4="http://schemas.microsoft.com/office/drawing/2016/5/10/chartex" xmlns:cx5="http://schemas.microsoft.com/office/drawing/2016/5/11/chartex" xmlns:cx6="http://schemas.microsoft.com/office/drawing/2016/5/12/chartex" xmlns:cx7="http://schemas.microsoft.com/office/drawing/2016/5/13/chartex" xmlns:cx8="http://schemas.microsoft.com/office/drawing/2016/5/14/chartex" xmlns:mc="http://schemas.openxmlformats.org/markup-compatibility/2006" xmlns:aink="http://schemas.microsoft.com/office/drawing/2016/ink" xmlns:am3d="http://schemas.microsoft.com/office/drawing/2017/model3d" xmlns:o="urn:schemas-microsoft-com:office:office" xmlns:oel="http://schemas.microsoft.com/office/2019/extlst" xmlns:r="http://schemas.openxmlformats.org/officeDocument/2006/relationships" xmlns:m="http://schemas.openxmlformats.org/officeDocument/2006/math" xmlns:v="urn:schemas-microsoft-com:vml" xmlns:wp14="http://schemas.microsoft.com/office/word/2010/wordprocessingDrawing" xmlns:wp="http://schemas.openxmlformats.org/drawingml/2006/wordprocessingDrawing" xmlns:w10="urn:schemas-microsoft-com:office:word" xmlns:w="http://schemas.openxmlformats.org/wordprocessingml/2006/main" xmlns:w14="http://schemas.microsoft.com/office/word/2010/wordml" xmlns:w15="http://schemas.microsoft.com/office/word/2012/wordml" xmlns:w16cex="http://schemas.microsoft.com/office/word/2018/wordml/cex" xmlns:w16cid="http://schemas.microsoft.com/office/word/2016/wordml/cid" xmlns:w16="http://schemas.microsoft.com/office/word/2018/wordml" xmlns:w16du="http://schemas.microsoft.com/office/word/2023/wordml/word16du" xmlns:w16sdtdh="http://schemas.microsoft.com/office/word/2020/wordml/sdtdatahash" xmlns:w16sdtfl="http://schemas.microsoft.com/office/word/2024/wordml/sdtformatlock" xmlns:w16se="http://schemas.microsoft.com/office/word/2015/wordml/symex" xmlns:wpg="http://schemas.microsoft.com/office/word/2010/wordprocessingGroup" xmlns:wpi="http://schemas.microsoft.com/office/word/2010/wordprocessingInk" xmlns:wne="http://schemas.microsoft.com/office/word/2006/wordml" xmlns:wps="http://schemas.microsoft.com/office/word/2010/wordprocessingShape" mc:Ignorable="w14 w15 w16se w16cid w16 w16cex w16sdtdh w16sdtfl w16du wp14">
   <w:p>
     <w:pPr>
       <w:pStyle w:val="Footer"/>

</xml_diff>